<commit_message>
Protocolo con derecho a descargo en denuncias anonimas + ambos documentos en Word
</commit_message>
<xml_diff>
--- a/Protocolo-Atencion-Denuncias-AJUCI.docx
+++ b/Protocolo-Atencion-Denuncias-AJUCI.docx
@@ -2,7 +2,6 @@
 <file path=word/document.xml><?xml version="1.0" encoding="utf-8"?>
 <w:document xmlns:wpc="http://schemas.microsoft.com/office/word/2010/wordprocessingCanvas" xmlns:mo="http://schemas.microsoft.com/office/mac/office/2008/main" xmlns:mc="http://schemas.openxmlformats.org/markup-compatibility/2006" xmlns:mv="urn:schemas-microsoft-com:mac:vml" xmlns:o="urn:schemas-microsoft-com:office:office" xmlns:r="http://schemas.openxmlformats.org/officeDocument/2006/relationships" xmlns:m="http://schemas.openxmlformats.org/officeDocument/2006/math" xmlns:v="urn:schemas-microsoft-com:vml" xmlns:wp14="http://schemas.microsoft.com/office/word/2010/wordprocessingDrawing" xmlns:wp="http://schemas.openxmlformats.org/drawingml/2006/wordprocessingDrawing" xmlns:w10="urn:schemas-microsoft-com:office:word" xmlns:w="http://schemas.openxmlformats.org/wordprocessingml/2006/main" xmlns:w14="http://schemas.microsoft.com/office/word/2010/wordml" xmlns:wpg="http://schemas.microsoft.com/office/word/2010/wordprocessingGroup" xmlns:wpi="http://schemas.microsoft.com/office/word/2010/wordprocessingInk" xmlns:wne="http://schemas.microsoft.com/office/word/2006/wordml" xmlns:wps="http://schemas.microsoft.com/office/word/2010/wordprocessingShape" mc:Ignorable="w14 wp14">
   <w:body>
-    <w:p/>
     <w:p/>
     <w:p>
       <w:pPr>
@@ -12,18 +11,19 @@
         <w:rPr>
           <w:b/>
           <w:color w:val="003366"/>
-          <w:sz w:val="36"/>
+          <w:sz w:val="28"/>
         </w:rPr>
         <w:t>PROTOCOLO DE ATENCION DE DENUNCIAS</w:t>
       </w:r>
     </w:p>
-    <w:p/>
     <w:p>
       <w:pPr>
         <w:jc w:val="center"/>
       </w:pPr>
       <w:r>
         <w:rPr>
+          <w:b/>
+          <w:color w:val="003366"/>
           <w:sz w:val="28"/>
         </w:rPr>
         <w:t>Comision Disciplinaria</w:t>
@@ -35,9 +35,11 @@
       </w:pPr>
       <w:r>
         <w:rPr>
+          <w:b/>
+          <w:color w:val="003366"/>
           <w:sz w:val="28"/>
         </w:rPr>
-        <w:t>Asociacion de Juzgamiento de Ciclismo (AJUCI)</w:t>
+        <w:t>AJUCI</w:t>
       </w:r>
     </w:p>
     <w:p>
@@ -46,39 +48,45 @@
       </w:pPr>
       <w:r>
         <w:rPr>
+          <w:b/>
+          <w:color w:val="003366"/>
           <w:sz w:val="28"/>
         </w:rPr>
-        <w:t>Federacion Costarricense de Ciclismo (FECOCI)</w:t>
-      </w:r>
-    </w:p>
-    <w:p/>
-    <w:p/>
-    <w:p>
-      <w:pPr>
-        <w:jc w:val="center"/>
-      </w:pPr>
-      <w:r>
-        <w:rPr>
-          <w:sz w:val="22"/>
-        </w:rPr>
-        <w:t>Correo: comdisc.ajuci@gmail.com</w:t>
-      </w:r>
-    </w:p>
-    <w:p/>
-    <w:p>
-      <w:pPr>
-        <w:jc w:val="center"/>
-      </w:pPr>
-      <w:r>
-        <w:rPr>
-          <w:sz w:val="22"/>
-        </w:rPr>
-        <w:t>Fecha: _______________</w:t>
+        <w:t>Federacion Costarricense de Ciclismo</w:t>
       </w:r>
     </w:p>
     <w:p>
       <w:r>
         <w:br w:type="page"/>
+      </w:r>
+    </w:p>
+    <w:p>
+      <w:r>
+        <w:t># PROTOCOLO DE ATENCIÓN DE DENUNCIAS</w:t>
+      </w:r>
+    </w:p>
+    <w:p>
+      <w:pPr>
+        <w:pStyle w:val="Heading1"/>
+      </w:pPr>
+      <w:r>
+        <w:t>COMISIÓN DISCIPLINARIA</w:t>
+      </w:r>
+    </w:p>
+    <w:p>
+      <w:pPr>
+        <w:pStyle w:val="Heading1"/>
+      </w:pPr>
+      <w:r>
+        <w:t>ASOCIACIÓN DE JUZGAMIENTO DE CICLISMO (AJUCI)</w:t>
+      </w:r>
+    </w:p>
+    <w:p>
+      <w:pPr>
+        <w:pStyle w:val="Heading1"/>
+      </w:pPr>
+      <w:r>
+        <w:t>FEDERACIÓN COSTARRICENSE DE CICLISMO (FECOCI)</w:t>
       </w:r>
     </w:p>
     <w:p>
@@ -91,7 +99,7 @@
     </w:p>
     <w:p>
       <w:r>
-        <w:t>Establecer el procedimiento que seguira la Comision Disciplinaria de AJUCI para la recepcion, instruccion y resolucion de denuncias presentadas contra miembros del cuerpo de juzgamiento (cronometristas, jueces y comisarios).</w:t>
+        <w:t>Establecer el procedimiento que seguirá la Comisión Disciplinaria de AJUCI para la recepción, instrucción y resolución de denuncias presentadas contra miembros del cuerpo de juzgamiento (cronometristas, jueces y comisarios).</w:t>
       </w:r>
     </w:p>
     <w:p>
@@ -104,7 +112,7 @@
     </w:p>
     <w:p>
       <w:r>
-        <w:t>Este protocolo aplica a todas las denuncias recibidas por la Comision Disciplinaria relacionadas con el desempeno, conducta o incumplimiento de deberes de los miembros del cuerpo de juzgamiento acreditados ante FECOCI y afiliados a AJUCI.</w:t>
+        <w:t>Este protocolo aplica a todas las denuncias recibidas por la Comisión Disciplinaria relacionadas con el desempeño, conducta o incumplimiento de deberes de los miembros del cuerpo de juzgamiento acreditados ante FECOCI y afiliados a AJUCI.</w:t>
       </w:r>
     </w:p>
     <w:p>
@@ -117,13 +125,7 @@
     </w:p>
     <w:p>
       <w:r>
-        <w:t xml:space="preserve">El proceso completo, desde la recepcion de la denuncia hasta el envio de la resolucion a la Junta Directiva de AJUCI, se completara en un plazo maximo de </w:t>
-      </w:r>
-      <w:r>
-        <w:rPr>
-          <w:b/>
-        </w:rPr>
-        <w:t>8 dias habiles.</w:t>
+        <w:t>El proceso completo, desde la recepción de la denuncia hasta el envío de la resolución a la Junta Directiva de AJUCI, se completará en un plazo máximo de **8 días hábiles**.</w:t>
       </w:r>
     </w:p>
     <w:p>
@@ -131,12 +133,12 @@
         <w:pStyle w:val="Heading1"/>
       </w:pPr>
       <w:r>
-        <w:t>4. CANAL DE RECEPCION</w:t>
+        <w:t>4. CANAL DE RECEPCIÓN</w:t>
       </w:r>
     </w:p>
     <w:p>
       <w:r>
-        <w:t>Las denuncias se recibiran a traves del correo electronico oficial de la Comision Disciplinaria:</w:t>
+        <w:t>Las denuncias se recibirán a través del correo electrónico oficial de la Comisión Disciplinaria:</w:t>
       </w:r>
     </w:p>
     <w:p>
@@ -160,7 +162,7 @@
         <w:pStyle w:val="Heading2"/>
       </w:pPr>
       <w:r>
-        <w:t>ETAPA 1: RECEPCION DE LA DENUNCIA (Dia 1)</w:t>
+        <w:t>ETAPA 1: RECEPCIÓN DE LA DENUNCIA (Día 1)</w:t>
       </w:r>
     </w:p>
     <w:p>
@@ -176,7 +178,7 @@
         <w:pStyle w:val="ListBullet"/>
       </w:pPr>
       <w:r>
-        <w:t>Se recibe correo electronico en la cuenta de la Comision Disciplinaria.</w:t>
+        <w:t>Se recibe correo electrónico en la cuenta de la Comisión Disciplinaria.</w:t>
       </w:r>
     </w:p>
     <w:p>
@@ -184,7 +186,7 @@
         <w:pStyle w:val="ListBullet"/>
       </w:pPr>
       <w:r>
-        <w:t>Se responde automaticamente al denunciante con un mensaje que incluye el enlace al Formulario de Denuncia (Google Forms) para que formalice su denuncia con la informacion requerida.</w:t>
+        <w:t>Se responde al denunciante con un mensaje que incluye el enlace al Formulario de Denuncia (Google Forms) para que formalice su denuncia con la información requerida.</w:t>
       </w:r>
     </w:p>
     <w:p>
@@ -192,10 +194,110 @@
         <w:rPr>
           <w:b/>
         </w:rPr>
-        <w:t xml:space="preserve">Responsable: </w:t>
+        <w:t>Responsable:</w:t>
       </w:r>
       <w:r>
-        <w:t>Sistema automatizado (respuesta automatica de Gmail).</w:t>
+        <w:t xml:space="preserve"> Sistema automatizado (respuesta automática de Gmail).</w:t>
+      </w:r>
+    </w:p>
+    <w:p>
+      <w:r>
+        <w:rPr>
+          <w:b/>
+        </w:rPr>
+        <w:t>Mensaje de respuesta:</w:t>
+      </w:r>
+    </w:p>
+    <w:p>
+      <w:r>
+        <w:rPr>
+          <w:i/>
+          <w:sz w:val="20"/>
+        </w:rPr>
+        <w:t>Estimado/a:</w:t>
+      </w:r>
+    </w:p>
+    <w:p>
+      <w:r>
+        <w:t>&gt;</w:t>
+      </w:r>
+    </w:p>
+    <w:p>
+      <w:r>
+        <w:rPr>
+          <w:i/>
+          <w:sz w:val="20"/>
+        </w:rPr>
+        <w:t>Gracias por comunicarse con la Comisión Disciplinaria de AJUCI. Para dar trámite formal a su denuncia, es necesario que complete el siguiente formulario:</w:t>
+      </w:r>
+    </w:p>
+    <w:p>
+      <w:r>
+        <w:t>&gt;</w:t>
+      </w:r>
+    </w:p>
+    <w:p>
+      <w:r>
+        <w:rPr>
+          <w:i/>
+          <w:sz w:val="20"/>
+        </w:rPr>
+        <w:t>[ENLACE AL FORMULARIO]</w:t>
+      </w:r>
+    </w:p>
+    <w:p>
+      <w:r>
+        <w:t>&gt;</w:t>
+      </w:r>
+    </w:p>
+    <w:p>
+      <w:r>
+        <w:rPr>
+          <w:i/>
+          <w:sz w:val="20"/>
+        </w:rPr>
+        <w:t>Una vez completado, se le asignará un número de caso y se le notificará.</w:t>
+      </w:r>
+    </w:p>
+    <w:p>
+      <w:r>
+        <w:t>&gt;</w:t>
+      </w:r>
+    </w:p>
+    <w:p>
+      <w:r>
+        <w:rPr>
+          <w:i/>
+          <w:sz w:val="20"/>
+        </w:rPr>
+        <w:t>Atentamente,</w:t>
+      </w:r>
+    </w:p>
+    <w:p>
+      <w:r>
+        <w:rPr>
+          <w:i/>
+          <w:sz w:val="20"/>
+        </w:rPr>
+        <w:t>Comisión Disciplinaria</w:t>
+      </w:r>
+    </w:p>
+    <w:p>
+      <w:r>
+        <w:rPr>
+          <w:i/>
+          <w:sz w:val="20"/>
+        </w:rPr>
+        <w:t>AJUCI</w:t>
+      </w:r>
+    </w:p>
+    <w:p>
+      <w:r>
+        <w:rPr>
+          <w:i/>
+          <w:sz w:val="20"/>
+        </w:rPr>
+        <w:t>Federación Costarricense de Ciclismo</w:t>
       </w:r>
     </w:p>
     <w:p>
@@ -203,7 +305,7 @@
         <w:pStyle w:val="Heading2"/>
       </w:pPr>
       <w:r>
-        <w:t>ETAPA 2: FORMALIZACION Y ASIGNACION DE CASO (Dia 1-2)</w:t>
+        <w:t>ETAPA 2: FORMALIZACIÓN Y ASIGNACIÓN DE CASO (Día 1-2)</w:t>
       </w:r>
     </w:p>
     <w:p>
@@ -227,7 +329,7 @@
         <w:pStyle w:val="ListBullet"/>
       </w:pPr>
       <w:r>
-        <w:t>El sistema asigna automaticamente un numero de caso con formato: CD-[ANO]-[CORRELATIVO] (Ejemplo: CD-2026-001).</w:t>
+        <w:t>El sistema asigna automáticamente un número de caso con formato: **CD-[AÑO]-[CORRELATIVO]** (Ejemplo: CD-2026-001).</w:t>
       </w:r>
     </w:p>
     <w:p>
@@ -235,7 +337,7 @@
         <w:pStyle w:val="ListBullet"/>
       </w:pPr>
       <w:r>
-        <w:t>Se envia correo automatico al denunciante confirmando la recepcion y el numero de caso asignado.</w:t>
+        <w:t>Se envía correo automático al denunciante confirmando la recepción y el número de caso asignado.</w:t>
       </w:r>
     </w:p>
     <w:p>
@@ -243,7 +345,7 @@
         <w:pStyle w:val="ListBullet"/>
       </w:pPr>
       <w:r>
-        <w:t>Se registra el caso en la hoja de calculo de seguimiento (Google Sheets).</w:t>
+        <w:t>Se registra el caso en la hoja de cálculo de seguimiento (Google Sheets).</w:t>
       </w:r>
     </w:p>
     <w:p>
@@ -251,10 +353,10 @@
         <w:rPr>
           <w:b/>
         </w:rPr>
-        <w:t xml:space="preserve">Responsable: </w:t>
+        <w:t>Responsable:</w:t>
       </w:r>
       <w:r>
-        <w:t>Sistema automatizado.</w:t>
+        <w:t xml:space="preserve"> Sistema automatizado.</w:t>
       </w:r>
     </w:p>
     <w:p>
@@ -262,7 +364,7 @@
         <w:rPr>
           <w:b/>
         </w:rPr>
-        <w:t>Informacion minima requerida en el formulario:</w:t>
+        <w:t>Información mínima requerida en el formulario:</w:t>
       </w:r>
     </w:p>
     <w:p>
@@ -270,7 +372,7 @@
         <w:pStyle w:val="ListBullet"/>
       </w:pPr>
       <w:r>
-        <w:t>Datos del denunciante (o indicacion de anonimato).</w:t>
+        <w:t>Datos del denunciante (o indicación de anonimato).</w:t>
       </w:r>
     </w:p>
     <w:p>
@@ -294,7 +396,7 @@
         <w:pStyle w:val="ListBullet"/>
       </w:pPr>
       <w:r>
-        <w:t>Descripcion detallada de los hechos.</w:t>
+        <w:t>Descripción detallada de los hechos.</w:t>
       </w:r>
     </w:p>
     <w:p>
@@ -310,7 +412,7 @@
         <w:pStyle w:val="Heading2"/>
       </w:pPr>
       <w:r>
-        <w:t>ETAPA 3: INSTRUCCION DEL EXPEDIENTE (Dia 2-5)</w:t>
+        <w:t>ETAPA 3: INSTRUCCIÓN DEL EXPEDIENTE (Día 2-5)</w:t>
       </w:r>
     </w:p>
     <w:p>
@@ -323,7 +425,7 @@
     </w:p>
     <w:p>
       <w:r>
-        <w:t>La Comision Disciplinaria recopila toda la informacion necesaria para resolver el caso:</w:t>
+        <w:t>La Comisión Disciplinaria recopila toda la información necesaria para resolver el caso:</w:t>
       </w:r>
     </w:p>
     <w:p>
@@ -331,7 +433,7 @@
         <w:pStyle w:val="ListBullet"/>
       </w:pPr>
       <w:r>
-        <w:t>Revision de la denuncia y pruebas aportadas por el denunciante.</w:t>
+        <w:t>Revisión de la denuncia y pruebas aportadas por el denunciante.</w:t>
       </w:r>
     </w:p>
     <w:p>
@@ -339,7 +441,7 @@
         <w:pStyle w:val="ListBullet"/>
       </w:pPr>
       <w:r>
-        <w:t>Solicitud de informacion adicional (si es necesario):</w:t>
+        <w:t>Solicitud de información adicional (si es necesario):</w:t>
       </w:r>
     </w:p>
     <w:p>
@@ -347,7 +449,7 @@
         <w:pStyle w:val="ListBullet"/>
       </w:pPr>
       <w:r>
-        <w:t xml:space="preserve">    - Informes de comisarios del evento (Art. 10 h del Protocolo FECOCI).</w:t>
+        <w:t>Informes de comisarios del evento (Art. 10 h del Protocolo FECOCI).</w:t>
       </w:r>
     </w:p>
     <w:p>
@@ -355,7 +457,7 @@
         <w:pStyle w:val="ListBullet"/>
       </w:pPr>
       <w:r>
-        <w:t xml:space="preserve">    - Calificacion del evento emitida por el Comisario Nacional principal (Art. 14).</w:t>
+        <w:t>Calificación del evento emitida por el Comisario Nacional principal (Art. 14 del Protocolo FECOCI).</w:t>
       </w:r>
     </w:p>
     <w:p>
@@ -363,7 +465,7 @@
         <w:pStyle w:val="ListBullet"/>
       </w:pPr>
       <w:r>
-        <w:t xml:space="preserve">    - Evaluaciones de desempeno (formularios de organizadores).</w:t>
+        <w:t>Evaluaciones de desempeño (formularios de organizadores).</w:t>
       </w:r>
     </w:p>
     <w:p>
@@ -371,7 +473,7 @@
         <w:pStyle w:val="ListBullet"/>
       </w:pPr>
       <w:r>
-        <w:t xml:space="preserve">    - Testimonios de terceros.</w:t>
+        <w:t>Testimonios de terceros.</w:t>
       </w:r>
     </w:p>
     <w:p>
@@ -379,7 +481,7 @@
         <w:pStyle w:val="ListBullet"/>
       </w:pPr>
       <w:r>
-        <w:t xml:space="preserve">    - Documentos, fotos, videos u otra evidencia.</w:t>
+        <w:t>Documentos, fotos, videos u otra evidencia.</w:t>
       </w:r>
     </w:p>
     <w:p>
@@ -387,7 +489,7 @@
         <w:pStyle w:val="ListBullet"/>
       </w:pPr>
       <w:r>
-        <w:t>Consulta al Comite de Nombramientos si el caso lo amerita.</w:t>
+        <w:t>Consulta al Comité de Nombramientos si el caso lo amerita.</w:t>
       </w:r>
     </w:p>
     <w:p>
@@ -395,7 +497,7 @@
         <w:pStyle w:val="ListBullet"/>
       </w:pPr>
       <w:r>
-        <w:t>Verificacion de antecedentes disciplinarios del denunciado.</w:t>
+        <w:t>Verificación de antecedentes disciplinarios del denunciado.</w:t>
       </w:r>
     </w:p>
     <w:p>
@@ -403,10 +505,10 @@
         <w:rPr>
           <w:b/>
         </w:rPr>
-        <w:t xml:space="preserve">Responsable: </w:t>
+        <w:t>Responsable:</w:t>
       </w:r>
       <w:r>
-        <w:t>Todos los miembros de la Comision Disciplinaria.</w:t>
+        <w:t xml:space="preserve"> Todos los miembros de la Comisión Disciplinaria.</w:t>
       </w:r>
     </w:p>
     <w:p>
@@ -414,10 +516,10 @@
         <w:rPr>
           <w:b/>
         </w:rPr>
-        <w:t xml:space="preserve">Producto: </w:t>
+        <w:t>Producto:</w:t>
       </w:r>
       <w:r>
-        <w:t>Expediente instruido con toda la evidencia recopilada.</w:t>
+        <w:t xml:space="preserve"> Expediente instruido con toda la evidencia recopilada.</w:t>
       </w:r>
     </w:p>
     <w:p>
@@ -425,7 +527,7 @@
         <w:pStyle w:val="Heading2"/>
       </w:pPr>
       <w:r>
-        <w:t>ETAPA 4: DELIBERACION Y RESOLUCION (Dia 6-7)</w:t>
+        <w:t>ETAPA 4: DELIBERACIÓN Y RESOLUCIÓN (Día 6-7)</w:t>
       </w:r>
     </w:p>
     <w:p>
@@ -438,7 +540,7 @@
     </w:p>
     <w:p>
       <w:r>
-        <w:t>La Comision Disciplinaria se reune (presencial o virtualmente) para:</w:t>
+        <w:t>La Comisión Disciplinaria se reúne (presencial o virtualmente) para:</w:t>
       </w:r>
     </w:p>
     <w:p>
@@ -454,7 +556,7 @@
         <w:pStyle w:val="ListBullet"/>
       </w:pPr>
       <w:r>
-        <w:t>Determinar si los hechos constituyen una falta y su clasificacion (leve, grave o muy grave).</w:t>
+        <w:t>Determinar si los hechos constituyen una falta y su clasificación (leve, grave o muy grave).</w:t>
       </w:r>
     </w:p>
     <w:p>
@@ -462,7 +564,7 @@
         <w:pStyle w:val="ListBullet"/>
       </w:pPr>
       <w:r>
-        <w:t>Emitir resolucion:</w:t>
+        <w:t>Emitir resolución:</w:t>
       </w:r>
     </w:p>
     <w:p>
@@ -470,7 +572,13 @@
         <w:pStyle w:val="ListBullet"/>
       </w:pPr>
       <w:r>
-        <w:t xml:space="preserve">    - ARCHIVO: Si los hechos no constituyen falta o la evidencia es insuficiente.</w:t>
+        <w:rPr>
+          <w:b/>
+        </w:rPr>
+        <w:t>Archivo:</w:t>
+      </w:r>
+      <w:r>
+        <w:t xml:space="preserve"> Si los hechos no constituyen falta o la evidencia es insuficiente.</w:t>
       </w:r>
     </w:p>
     <w:p>
@@ -478,12 +586,13 @@
         <w:pStyle w:val="ListBullet"/>
       </w:pPr>
       <w:r>
-        <w:t xml:space="preserve">    - SANCION: Si se comprueba la falta, se determina la sancion correspondiente.</w:t>
+        <w:rPr>
+          <w:b/>
+        </w:rPr>
+        <w:t>Sanción:</w:t>
       </w:r>
-    </w:p>
-    <w:p>
       <w:r>
-        <w:t>La resolucion escrita debera contener:</w:t>
+        <w:t xml:space="preserve"> Si se comprueba la falta, se determina la sanción correspondiente.</w:t>
       </w:r>
     </w:p>
     <w:p>
@@ -491,7 +600,15 @@
         <w:pStyle w:val="ListBullet"/>
       </w:pPr>
       <w:r>
-        <w:t>Numero de caso.</w:t>
+        <w:t>Redactar la resolución por escrito, incluyendo:</w:t>
+      </w:r>
+    </w:p>
+    <w:p>
+      <w:pPr>
+        <w:pStyle w:val="ListBullet"/>
+      </w:pPr>
+      <w:r>
+        <w:t>Número de caso.</w:t>
       </w:r>
     </w:p>
     <w:p>
@@ -515,7 +632,7 @@
         <w:pStyle w:val="ListBullet"/>
       </w:pPr>
       <w:r>
-        <w:t>Normas aplicadas (articulos del Protocolo FECOCI o regulaciones UCI).</w:t>
+        <w:t>Normas aplicadas (artículos del Protocolo FECOCI o regulaciones UCI).</w:t>
       </w:r>
     </w:p>
     <w:p>
@@ -523,7 +640,7 @@
         <w:pStyle w:val="ListBullet"/>
       </w:pPr>
       <w:r>
-        <w:t>Decision y fundamento.</w:t>
+        <w:t>Decisión y fundamento.</w:t>
       </w:r>
     </w:p>
     <w:p>
@@ -531,10 +648,10 @@
         <w:rPr>
           <w:b/>
         </w:rPr>
-        <w:t xml:space="preserve">Responsable: </w:t>
+        <w:t>Responsable:</w:t>
       </w:r>
       <w:r>
-        <w:t>Todos los miembros de la Comision Disciplinaria (se requiere mayoria para la decision).</w:t>
+        <w:t xml:space="preserve"> Todos los miembros de la Comisión Disciplinaria (se requiere mayoría para la decisión).</w:t>
       </w:r>
     </w:p>
     <w:p>
@@ -542,10 +659,10 @@
         <w:rPr>
           <w:b/>
         </w:rPr>
-        <w:t xml:space="preserve">Producto: </w:t>
+        <w:t>Producto:</w:t>
       </w:r>
       <w:r>
-        <w:t>Resolucion escrita firmada por los miembros de la Comision.</w:t>
+        <w:t xml:space="preserve"> Resolución escrita firmada por los miembros de la Comisión.</w:t>
       </w:r>
     </w:p>
     <w:p>
@@ -553,7 +670,7 @@
         <w:pStyle w:val="Heading2"/>
       </w:pPr>
       <w:r>
-        <w:t>ETAPA 5: ENVIO A JUNTA DIRECTIVA DE AJUCI (Dia 8)</w:t>
+        <w:t>ETAPA 5: ENVÍO A JUNTA DIRECTIVA DE AJUCI (Día 8)</w:t>
       </w:r>
     </w:p>
     <w:p>
@@ -569,7 +686,7 @@
         <w:pStyle w:val="ListBullet"/>
       </w:pPr>
       <w:r>
-        <w:t>Se envia la resolucion completa a la Junta Directiva de AJUCI para que:</w:t>
+        <w:t>Se envía la resolución completa a la Junta Directiva de AJUCI para que:</w:t>
       </w:r>
     </w:p>
     <w:p>
@@ -577,7 +694,7 @@
         <w:pStyle w:val="ListBullet"/>
       </w:pPr>
       <w:r>
-        <w:t xml:space="preserve">    - Comunique la decision al/los involucrado(s).</w:t>
+        <w:t>Comunique la decisión al/los involucrado(s).</w:t>
       </w:r>
     </w:p>
     <w:p>
@@ -585,7 +702,7 @@
         <w:pStyle w:val="ListBullet"/>
       </w:pPr>
       <w:r>
-        <w:t xml:space="preserve">    - Ejecute la sancion (si la hay).</w:t>
+        <w:t>Ejecute la sanción (si la hay).</w:t>
       </w:r>
     </w:p>
     <w:p>
@@ -593,7 +710,7 @@
         <w:pStyle w:val="ListBullet"/>
       </w:pPr>
       <w:r>
-        <w:t xml:space="preserve">    - Informe al Comite de Nombramientos (en caso de suspension o perdida de condicion).</w:t>
+        <w:t>Informe al Comité de Nombramientos (en caso de suspensión o pérdida de condición).</w:t>
       </w:r>
     </w:p>
     <w:p>
@@ -601,7 +718,7 @@
         <w:pStyle w:val="ListBullet"/>
       </w:pPr>
       <w:r>
-        <w:t>Se notifica al denunciante que su caso ha sido resuelto.</w:t>
+        <w:t>Se notifica al denunciante que su caso ha sido resuelto y que la Junta Directiva comunicará la decisión.</w:t>
       </w:r>
     </w:p>
     <w:p>
@@ -609,7 +726,7 @@
         <w:pStyle w:val="ListBullet"/>
       </w:pPr>
       <w:r>
-        <w:t>Se actualiza el estado del caso en Google Sheets como 'Resuelto - Enviado a JD'.</w:t>
+        <w:t>Se actualiza el estado del caso en el Google Sheets como "Resuelto - Enviado a JD".</w:t>
       </w:r>
     </w:p>
     <w:p>
@@ -617,10 +734,96 @@
         <w:rPr>
           <w:b/>
         </w:rPr>
-        <w:t xml:space="preserve">Responsable: </w:t>
+        <w:t>Responsable:</w:t>
       </w:r>
       <w:r>
-        <w:t>Presidente/a de la Comision Disciplinaria.</w:t>
+        <w:t xml:space="preserve"> Presidente/a de la Comisión Disciplinaria.</w:t>
+      </w:r>
+    </w:p>
+    <w:p>
+      <w:r>
+        <w:rPr>
+          <w:b/>
+        </w:rPr>
+        <w:t>Comunicación a Junta Directiva:</w:t>
+      </w:r>
+    </w:p>
+    <w:p>
+      <w:r>
+        <w:rPr>
+          <w:i/>
+          <w:sz w:val="20"/>
+        </w:rPr>
+        <w:t>Estimados miembros de la Junta Directiva de AJUCI:</w:t>
+      </w:r>
+    </w:p>
+    <w:p>
+      <w:r>
+        <w:t>&gt;</w:t>
+      </w:r>
+    </w:p>
+    <w:p>
+      <w:r>
+        <w:rPr>
+          <w:i/>
+          <w:sz w:val="20"/>
+        </w:rPr>
+        <w:t>La Comisión Disciplinaria ha emitido resolución en el caso No. [NÚMERO DE CASO].</w:t>
+      </w:r>
+    </w:p>
+    <w:p>
+      <w:r>
+        <w:t>&gt;</w:t>
+      </w:r>
+    </w:p>
+    <w:p>
+      <w:r>
+        <w:rPr>
+          <w:i/>
+          <w:sz w:val="20"/>
+        </w:rPr>
+        <w:t>Se adjunta la resolución completa para su conocimiento y para que procedan con la comunicación al/los involucrado(s) y la ejecución de la decisión.</w:t>
+      </w:r>
+    </w:p>
+    <w:p>
+      <w:r>
+        <w:t>&gt;</w:t>
+      </w:r>
+    </w:p>
+    <w:p>
+      <w:r>
+        <w:rPr>
+          <w:i/>
+          <w:sz w:val="20"/>
+        </w:rPr>
+        <w:t>Atentamente,</w:t>
+      </w:r>
+    </w:p>
+    <w:p>
+      <w:r>
+        <w:rPr>
+          <w:i/>
+          <w:sz w:val="20"/>
+        </w:rPr>
+        <w:t>Comisión Disciplinaria</w:t>
+      </w:r>
+    </w:p>
+    <w:p>
+      <w:r>
+        <w:rPr>
+          <w:i/>
+          <w:sz w:val="20"/>
+        </w:rPr>
+        <w:t>AJUCI</w:t>
+      </w:r>
+    </w:p>
+    <w:p>
+      <w:r>
+        <w:rPr>
+          <w:i/>
+          <w:sz w:val="20"/>
+        </w:rPr>
+        <w:t>Federación Costarricense de Ciclismo</w:t>
       </w:r>
     </w:p>
     <w:p>
@@ -631,255 +834,157 @@
         <w:t>6. RESUMEN DE PLAZOS</w:t>
       </w:r>
     </w:p>
-    <w:tbl>
-      <w:tblPr>
-        <w:tblStyle w:val="TableGrid"/>
-        <w:tblW w:type="auto" w:w="0"/>
-        <w:tblLook w:firstColumn="1" w:firstRow="1" w:lastColumn="0" w:lastRow="0" w:noHBand="0" w:noVBand="1" w:val="04A0"/>
-      </w:tblPr>
-      <w:tblGrid>
-        <w:gridCol w:w="3135"/>
-        <w:gridCol w:w="3135"/>
-        <w:gridCol w:w="3135"/>
-      </w:tblGrid>
-      <w:tr>
-        <w:tc>
-          <w:tcPr>
-            <w:tcW w:type="dxa" w:w="3135"/>
-          </w:tcPr>
-          <w:p>
-            <w:r>
-              <w:rPr>
-                <w:b/>
-              </w:rPr>
-              <w:t>Etapa</w:t>
-            </w:r>
-          </w:p>
-        </w:tc>
-        <w:tc>
-          <w:tcPr>
-            <w:tcW w:type="dxa" w:w="3135"/>
-          </w:tcPr>
-          <w:p>
-            <w:r>
-              <w:rPr>
-                <w:b/>
-              </w:rPr>
-              <w:t>Actividad</w:t>
-            </w:r>
-          </w:p>
-        </w:tc>
-        <w:tc>
-          <w:tcPr>
-            <w:tcW w:type="dxa" w:w="3135"/>
-          </w:tcPr>
-          <w:p>
-            <w:r>
-              <w:rPr>
-                <w:b/>
-              </w:rPr>
-              <w:t>Plazo</w:t>
-            </w:r>
-          </w:p>
-        </w:tc>
-      </w:tr>
-      <w:tr>
-        <w:tc>
-          <w:tcPr>
-            <w:tcW w:type="dxa" w:w="3135"/>
-          </w:tcPr>
-          <w:p>
-            <w:r>
-              <w:t>1</w:t>
-            </w:r>
-          </w:p>
-        </w:tc>
-        <w:tc>
-          <w:tcPr>
-            <w:tcW w:type="dxa" w:w="3135"/>
-          </w:tcPr>
-          <w:p>
-            <w:r>
-              <w:t>Recepcion + envio de formulario</w:t>
-            </w:r>
-          </w:p>
-        </w:tc>
-        <w:tc>
-          <w:tcPr>
-            <w:tcW w:type="dxa" w:w="3135"/>
-          </w:tcPr>
-          <w:p>
-            <w:r>
-              <w:t>Dia 1</w:t>
-            </w:r>
-          </w:p>
-        </w:tc>
-      </w:tr>
-      <w:tr>
-        <w:tc>
-          <w:tcPr>
-            <w:tcW w:type="dxa" w:w="3135"/>
-          </w:tcPr>
-          <w:p>
-            <w:r>
-              <w:t>2</w:t>
-            </w:r>
-          </w:p>
-        </w:tc>
-        <w:tc>
-          <w:tcPr>
-            <w:tcW w:type="dxa" w:w="3135"/>
-          </w:tcPr>
-          <w:p>
-            <w:r>
-              <w:t>Formalizacion + numero de caso</w:t>
-            </w:r>
-          </w:p>
-        </w:tc>
-        <w:tc>
-          <w:tcPr>
-            <w:tcW w:type="dxa" w:w="3135"/>
-          </w:tcPr>
-          <w:p>
-            <w:r>
-              <w:t>Dia 1-2</w:t>
-            </w:r>
-          </w:p>
-        </w:tc>
-      </w:tr>
-      <w:tr>
-        <w:tc>
-          <w:tcPr>
-            <w:tcW w:type="dxa" w:w="3135"/>
-          </w:tcPr>
-          <w:p>
-            <w:r>
-              <w:t>3</w:t>
-            </w:r>
-          </w:p>
-        </w:tc>
-        <w:tc>
-          <w:tcPr>
-            <w:tcW w:type="dxa" w:w="3135"/>
-          </w:tcPr>
-          <w:p>
-            <w:r>
-              <w:t>Instruccion del expediente</w:t>
-            </w:r>
-          </w:p>
-        </w:tc>
-        <w:tc>
-          <w:tcPr>
-            <w:tcW w:type="dxa" w:w="3135"/>
-          </w:tcPr>
-          <w:p>
-            <w:r>
-              <w:t>Dia 2-5</w:t>
-            </w:r>
-          </w:p>
-        </w:tc>
-      </w:tr>
-      <w:tr>
-        <w:tc>
-          <w:tcPr>
-            <w:tcW w:type="dxa" w:w="3135"/>
-          </w:tcPr>
-          <w:p>
-            <w:r>
-              <w:t>4</w:t>
-            </w:r>
-          </w:p>
-        </w:tc>
-        <w:tc>
-          <w:tcPr>
-            <w:tcW w:type="dxa" w:w="3135"/>
-          </w:tcPr>
-          <w:p>
-            <w:r>
-              <w:t>Deliberacion y resolucion</w:t>
-            </w:r>
-          </w:p>
-        </w:tc>
-        <w:tc>
-          <w:tcPr>
-            <w:tcW w:type="dxa" w:w="3135"/>
-          </w:tcPr>
-          <w:p>
-            <w:r>
-              <w:t>Dia 6-7</w:t>
-            </w:r>
-          </w:p>
-        </w:tc>
-      </w:tr>
-      <w:tr>
-        <w:tc>
-          <w:tcPr>
-            <w:tcW w:type="dxa" w:w="3135"/>
-          </w:tcPr>
-          <w:p>
-            <w:r>
-              <w:t>5</w:t>
-            </w:r>
-          </w:p>
-        </w:tc>
-        <w:tc>
-          <w:tcPr>
-            <w:tcW w:type="dxa" w:w="3135"/>
-          </w:tcPr>
-          <w:p>
-            <w:r>
-              <w:t>Envio a Junta Directiva</w:t>
-            </w:r>
-          </w:p>
-        </w:tc>
-        <w:tc>
-          <w:tcPr>
-            <w:tcW w:type="dxa" w:w="3135"/>
-          </w:tcPr>
-          <w:p>
-            <w:r>
-              <w:t>Dia 8</w:t>
-            </w:r>
-          </w:p>
-        </w:tc>
-      </w:tr>
-      <w:tr>
-        <w:tc>
-          <w:tcPr>
-            <w:tcW w:type="dxa" w:w="3135"/>
-          </w:tcPr>
-          <w:p>
-            <w:r/>
-          </w:p>
-        </w:tc>
-        <w:tc>
-          <w:tcPr>
-            <w:tcW w:type="dxa" w:w="3135"/>
-          </w:tcPr>
-          <w:p>
-            <w:r>
-              <w:t>TOTAL</w:t>
-            </w:r>
-          </w:p>
-        </w:tc>
-        <w:tc>
-          <w:tcPr>
-            <w:tcW w:type="dxa" w:w="3135"/>
-          </w:tcPr>
-          <w:p>
-            <w:r>
-              <w:t>8 dias habiles</w:t>
-            </w:r>
-          </w:p>
-        </w:tc>
-      </w:tr>
-    </w:tbl>
+    <w:p>
+      <w:pPr/>
+      <w:r>
+        <w:rPr>
+          <w:rFonts w:ascii="Courier New" w:hAnsi="Courier New"/>
+          <w:sz w:val="18"/>
+        </w:rPr>
+        <w:t>| Etapa | Actividad | Plazo |</w:t>
+      </w:r>
+    </w:p>
+    <w:p>
+      <w:r>
+        <w:t>|-------|-----------|-------|</w:t>
+      </w:r>
+    </w:p>
+    <w:p>
+      <w:pPr/>
+      <w:r>
+        <w:rPr>
+          <w:rFonts w:ascii="Courier New" w:hAnsi="Courier New"/>
+          <w:sz w:val="18"/>
+        </w:rPr>
+        <w:t>| 1 | Recepción de denuncia + envío de formulario | Día 1 |</w:t>
+      </w:r>
+    </w:p>
+    <w:p>
+      <w:pPr/>
+      <w:r>
+        <w:rPr>
+          <w:rFonts w:ascii="Courier New" w:hAnsi="Courier New"/>
+          <w:sz w:val="18"/>
+        </w:rPr>
+        <w:t>| 2 | Formalización + asignación de número de caso | Día 1-2 |</w:t>
+      </w:r>
+    </w:p>
+    <w:p>
+      <w:pPr/>
+      <w:r>
+        <w:rPr>
+          <w:rFonts w:ascii="Courier New" w:hAnsi="Courier New"/>
+          <w:sz w:val="18"/>
+        </w:rPr>
+        <w:t>| 3 | Instrucción del expediente (investigación) | Día 2-5 |</w:t>
+      </w:r>
+    </w:p>
+    <w:p>
+      <w:pPr/>
+      <w:r>
+        <w:rPr>
+          <w:rFonts w:ascii="Courier New" w:hAnsi="Courier New"/>
+          <w:sz w:val="18"/>
+        </w:rPr>
+        <w:t>| 4 | Deliberación y resolución | Día 6-7 |</w:t>
+      </w:r>
+    </w:p>
+    <w:p>
+      <w:pPr/>
+      <w:r>
+        <w:rPr>
+          <w:rFonts w:ascii="Courier New" w:hAnsi="Courier New"/>
+          <w:sz w:val="18"/>
+        </w:rPr>
+        <w:t>| 5 | Envío a Junta Directiva de AJUCI | Día 8 |</w:t>
+      </w:r>
+    </w:p>
+    <w:p>
+      <w:pPr/>
+      <w:r>
+        <w:rPr>
+          <w:rFonts w:ascii="Courier New" w:hAnsi="Courier New"/>
+          <w:sz w:val="18"/>
+        </w:rPr>
+        <w:t>| | **TOTAL** | **8 días hábiles** |</w:t>
+      </w:r>
+    </w:p>
     <w:p>
       <w:pPr>
         <w:pStyle w:val="Heading1"/>
       </w:pPr>
       <w:r>
-        <w:t>7. CONSIDERACIONES IMPORTANTES</w:t>
+        <w:t>7. DIAGRAMA DE FLUJO</w:t>
+      </w:r>
+    </w:p>
+    <w:p>
+      <w:r>
+        <w:t>DENUNCIANTE envía correo</w:t>
+      </w:r>
+    </w:p>
+    <w:p>
+      <w:r>
+        <w:t>|</w:t>
+      </w:r>
+    </w:p>
+    <w:p>
+      <w:r>
+        <w:t>v</w:t>
+      </w:r>
+    </w:p>
+    <w:p>
+      <w:r>
+        <w:t>[Día 1] Comisión responde con enlace al formulario</w:t>
+      </w:r>
+    </w:p>
+    <w:p>
+      <w:r>
+        <w:t>|</w:t>
+      </w:r>
+    </w:p>
+    <w:p>
+      <w:r>
+        <w:t>v</w:t>
+      </w:r>
+    </w:p>
+    <w:p>
+      <w:r>
+        <w:t>DENUNCIANTE completa formulario</w:t>
+      </w:r>
+    </w:p>
+    <w:p>
+      <w:r>
+        <w:t>|</w:t>
+      </w:r>
+    </w:p>
+    <w:p>
+      <w:r>
+        <w:t>v</w:t>
+      </w:r>
+    </w:p>
+    <w:p>
+      <w:r>
+        <w:t>[Día 1-2] Se asigna número de caso (automático)</w:t>
+      </w:r>
+    </w:p>
+    <w:p>
+      <w:r>
+        <w:t>Se confirma recepción al denunciante</w:t>
+      </w:r>
+    </w:p>
+    <w:p>
+      <w:r>
+        <w:t>|</w:t>
+      </w:r>
+    </w:p>
+    <w:p>
+      <w:r>
+        <w:t>v</w:t>
+      </w:r>
+    </w:p>
+    <w:p>
+      <w:r>
+        <w:t>[Día 2-5] INSTRUCCIÓN DEL EXPEDIENTE</w:t>
       </w:r>
     </w:p>
     <w:p>
@@ -887,7 +992,7 @@
         <w:pStyle w:val="ListBullet"/>
       </w:pPr>
       <w:r>
-        <w:t>Confidencialidad: Todo el proceso es confidencial hasta que la Junta Directiva comunique la resolucion a los involucrados.</w:t>
+        <w:t>Recopilar evidencia</w:t>
       </w:r>
     </w:p>
     <w:p>
@@ -895,7 +1000,7 @@
         <w:pStyle w:val="ListBullet"/>
       </w:pPr>
       <w:r>
-        <w:t>Conflicto de interes: Si algun miembro de la Comision Disciplinaria tiene relacion directa con el denunciante o el denunciado, debera inhibirse del caso.</w:t>
+        <w:t>Solicitar informes</w:t>
       </w:r>
     </w:p>
     <w:p>
@@ -903,7 +1008,22 @@
         <w:pStyle w:val="ListBullet"/>
       </w:pPr>
       <w:r>
-        <w:t>Denuncias anonimas: Se aceptan denuncias anonimas. La Comision evaluara si la evidencia aportada es suficiente para instruir el expediente sin necesidad de identificar al denunciante.</w:t>
+        <w:t>Revisar antecedentes</w:t>
+      </w:r>
+    </w:p>
+    <w:p>
+      <w:r>
+        <w:t>|</w:t>
+      </w:r>
+    </w:p>
+    <w:p>
+      <w:r>
+        <w:t>v</w:t>
+      </w:r>
+    </w:p>
+    <w:p>
+      <w:r>
+        <w:t>[Día 6-7] DELIBERACIÓN</w:t>
       </w:r>
     </w:p>
     <w:p>
@@ -911,7 +1031,7 @@
         <w:pStyle w:val="ListBullet"/>
       </w:pPr>
       <w:r>
-        <w:t>Casos de extrema gravedad: En situaciones que requieran accion inmediata (agresion fisica o acoso), la Comision podra emitir una recomendacion de suspension preventiva a la Junta Directiva de AJUCI antes de completar el proceso.</w:t>
+        <w:t>Sesión de la Comisión</w:t>
       </w:r>
     </w:p>
     <w:p>
@@ -919,7 +1039,54 @@
         <w:pStyle w:val="ListBullet"/>
       </w:pPr>
       <w:r>
-        <w:t>Extension de plazo: Si por razones excepcionales no es posible resolver en 8 dias habiles, la Comision podra extender el plazo hasta un maximo de 5 dias habiles adicionales, notificando al denunciante los motivos.</w:t>
+        <w:t>Análisis de evidencia</w:t>
+      </w:r>
+    </w:p>
+    <w:p>
+      <w:pPr>
+        <w:pStyle w:val="ListBullet"/>
+      </w:pPr>
+      <w:r>
+        <w:t>Emisión de resolución</w:t>
+      </w:r>
+    </w:p>
+    <w:p>
+      <w:r>
+        <w:t>|</w:t>
+      </w:r>
+    </w:p>
+    <w:p>
+      <w:r>
+        <w:t>v</w:t>
+      </w:r>
+    </w:p>
+    <w:p>
+      <w:r>
+        <w:t>[Día 8] ENVÍO A JUNTA DIRECTIVA DE AJUCI</w:t>
+      </w:r>
+    </w:p>
+    <w:p>
+      <w:pPr>
+        <w:pStyle w:val="ListBullet"/>
+      </w:pPr>
+      <w:r>
+        <w:t>Resolución completa</w:t>
+      </w:r>
+    </w:p>
+    <w:p>
+      <w:pPr>
+        <w:pStyle w:val="ListBullet"/>
+      </w:pPr>
+      <w:r>
+        <w:t>JD comunica a involucrados</w:t>
+      </w:r>
+    </w:p>
+    <w:p>
+      <w:pPr>
+        <w:pStyle w:val="ListBullet"/>
+      </w:pPr>
+      <w:r>
+        <w:t>JD ejecuta sanción (si aplica)</w:t>
       </w:r>
     </w:p>
     <w:p>
@@ -927,120 +1094,7 @@
         <w:pStyle w:val="Heading1"/>
       </w:pPr>
       <w:r>
-        <w:t>8. HERRAMIENTAS UTILIZADAS</w:t>
-      </w:r>
-    </w:p>
-    <w:tbl>
-      <w:tblPr>
-        <w:tblStyle w:val="TableGrid"/>
-        <w:tblW w:type="auto" w:w="0"/>
-        <w:tblLook w:firstColumn="1" w:firstRow="1" w:lastColumn="0" w:lastRow="0" w:noHBand="0" w:noVBand="1" w:val="04A0"/>
-      </w:tblPr>
-      <w:tblGrid>
-        <w:gridCol w:w="4703"/>
-        <w:gridCol w:w="4703"/>
-      </w:tblGrid>
-      <w:tr>
-        <w:tc>
-          <w:tcPr>
-            <w:tcW w:type="dxa" w:w="4703"/>
-          </w:tcPr>
-          <w:p>
-            <w:r>
-              <w:rPr>
-                <w:b/>
-              </w:rPr>
-              <w:t>Herramienta</w:t>
-            </w:r>
-          </w:p>
-        </w:tc>
-        <w:tc>
-          <w:tcPr>
-            <w:tcW w:type="dxa" w:w="4703"/>
-          </w:tcPr>
-          <w:p>
-            <w:r>
-              <w:rPr>
-                <w:b/>
-              </w:rPr>
-              <w:t>Uso</w:t>
-            </w:r>
-          </w:p>
-        </w:tc>
-      </w:tr>
-      <w:tr>
-        <w:tc>
-          <w:tcPr>
-            <w:tcW w:type="dxa" w:w="4703"/>
-          </w:tcPr>
-          <w:p>
-            <w:r>
-              <w:t>Gmail (comdisc.ajuci@gmail.com)</w:t>
-            </w:r>
-          </w:p>
-        </w:tc>
-        <w:tc>
-          <w:tcPr>
-            <w:tcW w:type="dxa" w:w="4703"/>
-          </w:tcPr>
-          <w:p>
-            <w:r>
-              <w:t>Recepcion de correos y comunicaciones</w:t>
-            </w:r>
-          </w:p>
-        </w:tc>
-      </w:tr>
-      <w:tr>
-        <w:tc>
-          <w:tcPr>
-            <w:tcW w:type="dxa" w:w="4703"/>
-          </w:tcPr>
-          <w:p>
-            <w:r>
-              <w:t>Google Forms</w:t>
-            </w:r>
-          </w:p>
-        </w:tc>
-        <w:tc>
-          <w:tcPr>
-            <w:tcW w:type="dxa" w:w="4703"/>
-          </w:tcPr>
-          <w:p>
-            <w:r>
-              <w:t>Formulario formal de denuncia</w:t>
-            </w:r>
-          </w:p>
-        </w:tc>
-      </w:tr>
-      <w:tr>
-        <w:tc>
-          <w:tcPr>
-            <w:tcW w:type="dxa" w:w="4703"/>
-          </w:tcPr>
-          <w:p>
-            <w:r>
-              <w:t>Google Sheets</w:t>
-            </w:r>
-          </w:p>
-        </w:tc>
-        <w:tc>
-          <w:tcPr>
-            <w:tcW w:type="dxa" w:w="4703"/>
-          </w:tcPr>
-          <w:p>
-            <w:r>
-              <w:t>Registro de casos y seguimiento</w:t>
-            </w:r>
-          </w:p>
-        </w:tc>
-      </w:tr>
-    </w:tbl>
-    <w:p>
-      <w:pPr>
-        <w:pStyle w:val="Heading1"/>
-      </w:pPr>
-      <w:r>
-        <w:t>9. REFERENCIAS NORMATIVAS</w:t>
+        <w:t>8. CONSIDERACIONES IMPORTANTES</w:t>
       </w:r>
     </w:p>
     <w:p>
@@ -1048,7 +1102,13 @@
         <w:pStyle w:val="ListBullet"/>
       </w:pPr>
       <w:r>
-        <w:t>Protocolo de arbitros, cronometristas, jueces y comisarios de ciclismo - FECOCI (aprobado en Sesion Extraordinaria No. 75, 18 de junio de 2024).</w:t>
+        <w:rPr>
+          <w:b/>
+        </w:rPr>
+        <w:t>Confidencialidad:</w:t>
+      </w:r>
+      <w:r>
+        <w:t xml:space="preserve"> Todo el proceso es confidencial hasta que la Junta Directiva comunique la resolución a los involucrados.</w:t>
       </w:r>
     </w:p>
     <w:p>
@@ -1056,7 +1116,13 @@
         <w:pStyle w:val="ListBullet"/>
       </w:pPr>
       <w:r>
-        <w:t>UCI Reglamento Deportivo, Titulo XII: Disciplina y Procedimientos.</w:t>
+        <w:rPr>
+          <w:b/>
+        </w:rPr>
+        <w:t>Conflicto de interés:</w:t>
+      </w:r>
+      <w:r>
+        <w:t xml:space="preserve"> Si algún miembro de la Comisión Disciplinaria tiene relación directa con el denunciante o el denunciado, deberá inhibirse del caso.</w:t>
       </w:r>
     </w:p>
     <w:p>
@@ -1064,11 +1130,152 @@
         <w:pStyle w:val="ListBullet"/>
       </w:pPr>
       <w:r>
-        <w:t>UCI Codigo de Etica.</w:t>
+        <w:rPr>
+          <w:b/>
+        </w:rPr>
+        <w:t>Denuncias anónimas:</w:t>
+      </w:r>
+      <w:r>
+        <w:t xml:space="preserve"> Se aceptan denuncias anónimas. La Comisión evaluará si la evidencia aportada es suficiente para instruir el expediente sin necesidad de identificar al denunciante.</w:t>
       </w:r>
     </w:p>
-    <w:p/>
-    <w:p/>
+    <w:p>
+      <w:pPr>
+        <w:pStyle w:val="ListBullet"/>
+      </w:pPr>
+      <w:r>
+        <w:rPr>
+          <w:b/>
+        </w:rPr>
+        <w:t>Derecho a descargo en denuncias anónimas:</w:t>
+      </w:r>
+      <w:r>
+        <w:t xml:space="preserve"> Cuando la denuncia sea anónima y la Comisión Disciplinaria determine que existen indicios suficientes para instruir el expediente, se otorgará al denunciado un plazo de 3 días hábiles para presentar sus descargos por escrito. La notificación al denunciado se realizará a través de la Junta Directiva de AJUCI, indicando los hechos que se le imputan sin revelar la identidad del denunciante. Este plazo se contará dentro de los 8 días hábiles del proceso total.</w:t>
+      </w:r>
+    </w:p>
+    <w:p>
+      <w:pPr>
+        <w:pStyle w:val="ListBullet"/>
+      </w:pPr>
+      <w:r>
+        <w:rPr>
+          <w:b/>
+        </w:rPr>
+        <w:t>Casos de extrema gravedad:</w:t>
+      </w:r>
+      <w:r>
+        <w:t xml:space="preserve"> En situaciones que requieran acción inmediata (por ejemplo, agresión física o acoso), la Comisión podrá emitir una recomendación de suspensión preventiva a la Junta Directiva de AJUCI antes de completar el proceso.</w:t>
+      </w:r>
+    </w:p>
+    <w:p>
+      <w:pPr>
+        <w:pStyle w:val="ListBullet"/>
+      </w:pPr>
+      <w:r>
+        <w:rPr>
+          <w:b/>
+        </w:rPr>
+        <w:t>Extensión de plazo:</w:t>
+      </w:r>
+      <w:r>
+        <w:t xml:space="preserve"> Si por razones excepcionales (complejidad del caso, imposibilidad de obtener evidencia) no es posible resolver en 8 días hábiles, la Comisión podrá extender el plazo hasta un máximo de 5 días hábiles adicionales, notificando al denunciante los motivos de la extensión.</w:t>
+      </w:r>
+    </w:p>
+    <w:p>
+      <w:pPr>
+        <w:pStyle w:val="Heading1"/>
+      </w:pPr>
+      <w:r>
+        <w:t>9. HERRAMIENTAS UTILIZADAS</w:t>
+      </w:r>
+    </w:p>
+    <w:p>
+      <w:pPr/>
+      <w:r>
+        <w:rPr>
+          <w:rFonts w:ascii="Courier New" w:hAnsi="Courier New"/>
+          <w:sz w:val="18"/>
+        </w:rPr>
+        <w:t>| Herramienta | Uso |</w:t>
+      </w:r>
+    </w:p>
+    <w:p>
+      <w:r>
+        <w:t>|-------------|-----|</w:t>
+      </w:r>
+    </w:p>
+    <w:p>
+      <w:pPr/>
+      <w:r>
+        <w:rPr>
+          <w:rFonts w:ascii="Courier New" w:hAnsi="Courier New"/>
+          <w:sz w:val="18"/>
+        </w:rPr>
+        <w:t>| Gmail (comdisc.ajuci@gmail.com) | Recepción de correos y comunicaciones |</w:t>
+      </w:r>
+    </w:p>
+    <w:p>
+      <w:pPr/>
+      <w:r>
+        <w:rPr>
+          <w:rFonts w:ascii="Courier New" w:hAnsi="Courier New"/>
+          <w:sz w:val="18"/>
+        </w:rPr>
+        <w:t>| Google Forms | Formulario formal de denuncia |</w:t>
+      </w:r>
+    </w:p>
+    <w:p>
+      <w:pPr/>
+      <w:r>
+        <w:rPr>
+          <w:rFonts w:ascii="Courier New" w:hAnsi="Courier New"/>
+          <w:sz w:val="18"/>
+        </w:rPr>
+        <w:t>| Google Sheets | Registro de casos y seguimiento |</w:t>
+      </w:r>
+    </w:p>
+    <w:p>
+      <w:pPr/>
+      <w:r>
+        <w:rPr>
+          <w:rFonts w:ascii="Courier New" w:hAnsi="Courier New"/>
+          <w:sz w:val="18"/>
+        </w:rPr>
+        <w:t>| Google Apps Script | Asignación automática de número de caso y acuse de recibo |</w:t>
+      </w:r>
+    </w:p>
+    <w:p>
+      <w:pPr>
+        <w:pStyle w:val="Heading1"/>
+      </w:pPr>
+      <w:r>
+        <w:t>10. REFERENCIAS NORMATIVAS</w:t>
+      </w:r>
+    </w:p>
+    <w:p>
+      <w:pPr>
+        <w:pStyle w:val="ListBullet"/>
+      </w:pPr>
+      <w:r>
+        <w:t>Protocolo de árbitros, cronometristas, jueces y comisarios de ciclismo - FECOCI (aprobado en Sesión Extraordinaria No. 75, 18 de junio de 2024).</w:t>
+      </w:r>
+    </w:p>
+    <w:p>
+      <w:pPr>
+        <w:pStyle w:val="ListBullet"/>
+      </w:pPr>
+      <w:r>
+        <w:t>UCI Reglamento Deportivo, Título XII: Disciplina y Procedimientos.</w:t>
+      </w:r>
+    </w:p>
+    <w:p>
+      <w:pPr>
+        <w:pStyle w:val="ListBullet"/>
+      </w:pPr>
+      <w:r>
+        <w:t>UCI Código de Ética.</w:t>
+      </w:r>
+    </w:p>
     <w:p>
       <w:pPr>
         <w:jc w:val="center"/>
@@ -1077,7 +1284,7 @@
         <w:rPr>
           <w:i/>
         </w:rPr>
-        <w:t>Comision Disciplinaria</w:t>
+        <w:t>Comisión Disciplinaria</w:t>
       </w:r>
     </w:p>
     <w:p>
@@ -1099,7 +1306,7 @@
         <w:rPr>
           <w:i/>
         </w:rPr>
-        <w:t>Federacion Costarricense de Ciclismo</w:t>
+        <w:t>Federación Costarricense de Ciclismo</w:t>
       </w:r>
     </w:p>
     <w:p>
@@ -1110,7 +1317,7 @@
         <w:rPr>
           <w:i/>
         </w:rPr>
-        <w:t>Fecha de aprobacion: _______________</w:t>
+        <w:t>Fecha de aprobación: _______________</w:t>
       </w:r>
     </w:p>
     <w:sectPr>

</xml_diff>